<commit_message>
Fix double-numbered TOC in training documents
Co-Authored-By: Claude Opus 4.6 <noreply@anthropic.com>
</commit_message>
<xml_diff>
--- a/docs/Payer Mapping Tool - Admin Guide.docx
+++ b/docs/Payer Mapping Tool - Admin Guide.docx
@@ -59,73 +59,55 @@
       </w:r>
     </w:p>
     <w:p>
-      <w:pPr>
-        <w:pStyle w:val="ListNumber"/>
-      </w:pPr>
+      <w:pPr/>
       <w:r>
         <w:t>1. Overview</w:t>
       </w:r>
     </w:p>
     <w:p>
-      <w:pPr>
-        <w:pStyle w:val="ListNumber"/>
-      </w:pPr>
+      <w:pPr/>
       <w:r>
         <w:t>2. Logging In</w:t>
       </w:r>
     </w:p>
     <w:p>
-      <w:pPr>
-        <w:pStyle w:val="ListNumber"/>
-      </w:pPr>
+      <w:pPr/>
       <w:r>
         <w:t>3. Managing Clients</w:t>
       </w:r>
     </w:p>
     <w:p>
-      <w:pPr>
-        <w:pStyle w:val="ListNumber"/>
-      </w:pPr>
+      <w:pPr/>
       <w:r>
         <w:t>4. Viewing &amp; Exporting Data</w:t>
       </w:r>
     </w:p>
     <w:p>
-      <w:pPr>
-        <w:pStyle w:val="ListNumber"/>
-      </w:pPr>
+      <w:pPr/>
       <w:r>
         <w:t>5. Editing Client Mappings</w:t>
       </w:r>
     </w:p>
     <w:p>
-      <w:pPr>
-        <w:pStyle w:val="ListNumber"/>
-      </w:pPr>
+      <w:pPr/>
       <w:r>
         <w:t>6. Backend Management</w:t>
       </w:r>
     </w:p>
     <w:p>
-      <w:pPr>
-        <w:pStyle w:val="ListNumber"/>
-      </w:pPr>
+      <w:pPr/>
       <w:r>
         <w:t>7. Firebase Console</w:t>
       </w:r>
     </w:p>
     <w:p>
-      <w:pPr>
-        <w:pStyle w:val="ListNumber"/>
-      </w:pPr>
+      <w:pPr/>
       <w:r>
         <w:t>8. PHI Stripper Tool</w:t>
       </w:r>
     </w:p>
     <w:p>
-      <w:pPr>
-        <w:pStyle w:val="ListNumber"/>
-      </w:pPr>
+      <w:pPr/>
       <w:r>
         <w:t>9. Versioning &amp; Deployment</w:t>
       </w:r>

</xml_diff>